<commit_message>
training: infra, scripts, tests, docs
Dockerfile:
- PyTorch 2.1.2 + CUDA 11.8 base (V100/T4/A100 compatible)
- Includes gcloud CLI for GCS I/O

requirements-vertex.txt:
- Pinned dependencies for Vertex AI custom training container

scripts/:
- build_push.sh: build and push Docker image to Artifact Registry
- submit_train/tune/distill/eval/export.sh: Vertex AI job submission
- common_vars.sh: shared project/region/image variables

tests/:
- test_teacher_overfit.py: sanity-check that teacher can overfit a
  tiny batch before a full training run

docs/:
- yt-dlp-troubleshooting.md: notes on SABR streaming workaround,
  cookies setup, and caption fetch debugging

training_guide.docx, GCP_Migration_Plan.docx:
- Updated training runbook and Kaggle->Vertex AI migration plan
</commit_message>
<xml_diff>
--- a/training_guide.docx
+++ b/training_guide.docx
@@ -642,27 +642,84 @@
           <w:sz w:val="22"/>
           <w:szCs w:val="22"/>
         </w:rPr>
-        <w:t xml:space="preserve">Training runs in five sequential phases. Each phase is a self-contained Kaggle kernel push. The bridge script (</w:t>
-      </w:r>
-      <w:r>
-        <w:rPr>
-          <w:rFonts w:ascii="Courier New" w:cs="Courier New" w:eastAsia="Courier New" w:hAnsi="Courier New"/>
+        <w:t xml:space="preserve">Training runs in five sequential phases. Phase 1 (data collection) runs locally on your Mac using a residential IP to avoid YouTube rate limiting. The resulting embedding cache is synced to Google Cloud Storage (GCS) and pulled onto the GCP VM, where Phases 3 (teacher training) and 4 (knowledge distillation) run directly with Python. Phase 5 (ONNX export) also runs on the VM. No Kaggle bridge is used.</w:t>
+      </w:r>
+    </w:p>
+    <w:p>
+      <w:pPr>
+        <w:pStyle w:val="Heading2"/>
+        <w:spacing w:after="100" w:before="280"/>
+      </w:pPr>
+      <w:r>
+        <w:rPr>
+          <w:rFonts w:ascii="Arial" w:cs="Arial" w:eastAsia="Arial" w:hAnsi="Arial"/>
           <w:b/>
           <w:bCs/>
-          <w:color w:val="7C3AED"/>
-          <w:sz w:val="20"/>
-          <w:szCs w:val="20"/>
-        </w:rPr>
-        <w:t xml:space="preserve"> training/kaggle_bridge.py </w:t>
-      </w:r>
-      <w:r>
-        <w:rPr>
-          <w:rFonts w:ascii="Arial" w:cs="Arial" w:eastAsia="Arial" w:hAnsi="Arial"/>
-          <w:color w:val="1F2937"/>
-          <w:sz w:val="22"/>
-          <w:szCs w:val="22"/>
-        </w:rPr>
-        <w:t xml:space="preserve">) handles bundling, pushing, polling, and fetching outputs automatically.</w:t>
+          <w:color w:val="1F2937"/>
+          <w:sz w:val="28"/>
+          <w:szCs w:val="28"/>
+        </w:rPr>
+        <w:t xml:space="preserve">2.1  Why student-teacher training?</w:t>
+      </w:r>
+    </w:p>
+    <w:p>
+      <w:pPr>
+        <w:spacing w:after="100" w:before="0"/>
+        <w:jc w:val="left"/>
+      </w:pPr>
+      <w:r>
+        <w:rPr>
+          <w:rFonts w:ascii="Arial" w:cs="Arial" w:eastAsia="Arial" w:hAnsi="Arial"/>
+          <w:color w:val="1F2937"/>
+          <w:sz w:val="22"/>
+          <w:szCs w:val="22"/>
+        </w:rPr>
+        <w:t xml:space="preserve">The Chrome extension (student) can only use features it can compute in real-time inside a browser: MFCCs from the audio stream and keyword indicator vectors from the page’s captions. It cannot run Whisper or DistilBERT — those models are too large and slow for a browser environment. This creates a mismatch: the richest signal for detecting sponsors lives in features the student will never have access to at inference time.</w:t>
+      </w:r>
+    </w:p>
+    <w:p>
+      <w:pPr>
+        <w:spacing w:after="100" w:before="0"/>
+        <w:jc w:val="left"/>
+      </w:pPr>
+      <w:r>
+        <w:rPr>
+          <w:rFonts w:ascii="Arial" w:cs="Arial" w:eastAsia="Arial" w:hAnsi="Arial"/>
+          <w:color w:val="1F2937"/>
+          <w:sz w:val="22"/>
+          <w:szCs w:val="22"/>
+        </w:rPr>
+        <w:t xml:space="preserve">The teacher model is a bridge. It is trained first on the full set of rich features (Whisper audio embeddings + DistilBERT text embeddings + keyword vectors) against the hard 0/1 SponsorBlock labels. Because it has access to deep semantic and acoustic features, it learns to recognize sponsor segments accurately. It is then used to generate soft probability labels — for example 0.91, 0.08, 0.76 — for every 5-second window in the dataset.</w:t>
+      </w:r>
+    </w:p>
+    <w:p>
+      <w:pPr>
+        <w:spacing w:after="100" w:before="0"/>
+        <w:jc w:val="left"/>
+      </w:pPr>
+      <w:r>
+        <w:rPr>
+          <w:rFonts w:ascii="Arial" w:cs="Arial" w:eastAsia="Arial" w:hAnsi="Arial"/>
+          <w:color w:val="1F2937"/>
+          <w:sz w:val="22"/>
+          <w:szCs w:val="22"/>
+        </w:rPr>
+        <w:t xml:space="preserve">The student is then trained to reproduce those soft probabilities using only its limited browser-available features. Soft labels are easier to learn from than hard 0/1 annotations — a label of 0.91 carries more information than a label of 1, because it encodes the teacher’s confidence and smooths over noise in the SponsorBlock annotations. The student learns to use MFCCs and keyword vectors as effectively as possible to mimic the teacher’s judgments, even though it never sees the rich features the teacher used.</w:t>
+      </w:r>
+    </w:p>
+    <w:p>
+      <w:pPr>
+        <w:spacing w:after="100" w:before="0"/>
+        <w:jc w:val="left"/>
+      </w:pPr>
+      <w:r>
+        <w:rPr>
+          <w:rFonts w:ascii="Arial" w:cs="Arial" w:eastAsia="Arial" w:hAnsi="Arial"/>
+          <w:color w:val="1F2937"/>
+          <w:sz w:val="22"/>
+          <w:szCs w:val="22"/>
+        </w:rPr>
+        <w:t xml:space="preserve">In short: the teacher sees rich features and learns what sponsors sound and look like. It distills that knowledge into soft labels. The student learns the same thing using only the features a browser can compute.</w:t>
       </w:r>
     </w:p>
     <w:p>
@@ -777,7 +834,7 @@
                 <w:sz w:val="22"/>
                 <w:szCs w:val="22"/>
               </w:rPr>
-              <w:t xml:space="preserve">Download SponsorBlock CSV, fetch YouTube captions and audio, compute Whisper + DistilBERT embeddings, cache to .npz files. Upload cache to Kaggle Dataset.</w:t>
+              <w:t xml:space="preserve">Download SponsorBlock CSV, fetch YouTube captions and audio on your Mac (residential IP), compute Whisper + DistilBERT embeddings, cache to .npz files. Sync cache to GCS.</w:t>
             </w:r>
           </w:p>
         </w:tc>
@@ -1013,7 +1070,7 @@
                 <w:sz w:val="22"/>
                 <w:szCs w:val="22"/>
               </w:rPr>
-              <w:t xml:space="preserve">Train the large bimodal teacher model (DistilBERT + Whisper-tiny encoder + CrossAttention + BiLSTM). Saves teacher_best.pt. Upload checkpoint to Kaggle Dataset.</w:t>
+              <w:t xml:space="preserve">Run on GCP VM: hyperparameter search (tune.py) then full training (train.py). Trains the large bimodal teacher model (DistilBERT + Whisper-tiny encoder + CrossAttention + BiLSTM). Saves teacher_best.pt to training/outputs/teacher/.</w:t>
             </w:r>
           </w:p>
         </w:tc>
@@ -1392,7 +1449,7 @@
                 <w:sz w:val="22"/>
                 <w:szCs w:val="22"/>
               </w:rPr>
-              <w:t xml:space="preserve">Phases must be run in order. Phases 2–5 read from the embedding cache produced in Phase 1. Phase 4 reads the teacher checkpoint from Phase 3. The bridge's </w:t>
+              <w:t xml:space="preserve">Phases must be run in order. Phases 3–5 read from the embedding cache produced in Phase 1. Phase 4 reads the teacher checkpoint produced in Phase 3. Inter-phase data is transferred via GCS: push the cache from Mac with </w:t>
             </w:r>
             <w:r>
               <w:rPr>
@@ -1403,36 +1460,16 @@
                 <w:sz w:val="20"/>
                 <w:szCs w:val="20"/>
               </w:rPr>
-              <w:t xml:space="preserve"> --upload-cache </w:t>
-            </w:r>
-            <w:r>
-              <w:rPr>
-                <w:rFonts w:ascii="Arial" w:cs="Arial" w:eastAsia="Arial" w:hAnsi="Arial"/>
-                <w:color w:val="1F2937"/>
-                <w:sz w:val="22"/>
-                <w:szCs w:val="22"/>
-              </w:rPr>
-              <w:t xml:space="preserve"> and </w:t>
-            </w:r>
-            <w:r>
-              <w:rPr>
-                <w:rFonts w:ascii="Courier New" w:cs="Courier New" w:eastAsia="Courier New" w:hAnsi="Courier New"/>
-                <w:b/>
-                <w:bCs/>
-                <w:color w:val="7C3AED"/>
-                <w:sz w:val="20"/>
-                <w:szCs w:val="20"/>
-              </w:rPr>
-              <w:t xml:space="preserve"> --upload-teacher-ckpt </w:t>
-            </w:r>
-            <w:r>
-              <w:rPr>
-                <w:rFonts w:ascii="Arial" w:cs="Arial" w:eastAsia="Arial" w:hAnsi="Arial"/>
-                <w:color w:val="1F2937"/>
-                <w:sz w:val="22"/>
-                <w:szCs w:val="22"/>
-              </w:rPr>
-              <w:t xml:space="preserve"> flags handle the inter-phase Kaggle Dataset uploads.</w:t>
+              <w:t xml:space="preserve">gcloud storage rsync</w:t>
+            </w:r>
+            <w:r>
+              <w:rPr>
+                <w:rFonts w:ascii="Arial" w:cs="Arial" w:eastAsia="Arial" w:hAnsi="Arial"/>
+                <w:color w:val="1F2937"/>
+                <w:sz w:val="22"/>
+                <w:szCs w:val="22"/>
+              </w:rPr>
+              <w:t xml:space="preserve">, pull it on the VM, then run each phase directly with Python.</w:t>
             </w:r>
           </w:p>
         </w:tc>
@@ -1493,7 +1530,7 @@
           <w:sz w:val="28"/>
           <w:szCs w:val="28"/>
         </w:rPr>
-        <w:t xml:space="preserve">3.1  Dry-run first</w:t>
+        <w:t xml:space="preserve">3.1  Workflow overview</w:t>
       </w:r>
     </w:p>
     <w:p>
@@ -1508,7 +1545,22 @@
           <w:sz w:val="22"/>
           <w:szCs w:val="22"/>
         </w:rPr>
-        <w:t xml:space="preserve">Before consuming any GPU quota, validate credentials, source bundling, and notebook generation locally:</w:t>
+        <w:t xml:space="preserve">The pipeline spans two machines. Phase 1 runs on your Mac (residential IP, Apple MPS acceleration). Phases 3–5 run on the GCP VM (V100 GPU). Data moves between them via GCS.</w:t>
+      </w:r>
+    </w:p>
+    <w:p>
+      <w:pPr>
+        <w:spacing w:after="100" w:before="0"/>
+        <w:jc w:val="left"/>
+      </w:pPr>
+      <w:r>
+        <w:rPr>
+          <w:rFonts w:ascii="Arial" w:cs="Arial" w:eastAsia="Arial" w:hAnsi="Arial"/>
+          <w:color w:val="1F2937"/>
+          <w:sz w:val="22"/>
+          <w:szCs w:val="22"/>
+        </w:rPr>
+        <w:t xml:space="preserve">After Phase 1 finishes on Mac, sync the cache to GCS and pull it onto the VM:</w:t>
       </w:r>
     </w:p>
     <w:p>
@@ -1524,7 +1576,7 @@
           <w:sz w:val="18"/>
           <w:szCs w:val="18"/>
         </w:rPr>
-        <w:t xml:space="preserve"># Validate any phase without touching Kaggle</w:t>
+        <w:t xml:space="preserve"># On Mac: push embeddings to GCS</w:t>
       </w:r>
     </w:p>
     <w:p>
@@ -1540,7 +1592,7 @@
           <w:sz w:val="18"/>
           <w:szCs w:val="18"/>
         </w:rPr>
-        <w:t xml:space="preserve">python training/kaggle_bridge.py \</w:t>
+        <w:t xml:space="preserve">gcloud storage rsync -r training/cache/embeddings \</w:t>
       </w:r>
     </w:p>
     <w:p>
@@ -1556,7 +1608,7 @@
           <w:sz w:val="18"/>
           <w:szCs w:val="18"/>
         </w:rPr>
-        <w:t xml:space="preserve">    --config training/configs/phase3_teacher.json \</w:t>
+        <w:t xml:space="preserve">    gs://sponsor-segment-skipper-cache/embeddings</w:t>
       </w:r>
     </w:p>
     <w:p>
@@ -1572,7 +1624,71 @@
           <w:sz w:val="18"/>
           <w:szCs w:val="18"/>
         </w:rPr>
-        <w:t xml:space="preserve">    --dry-run</w:t>
+        <w:t xml:space="preserve"/>
+      </w:r>
+    </w:p>
+    <w:p>
+      <w:pPr>
+        <w:shd w:fill="1E1E1E" w:val="clear"/>
+        <w:spacing w:after="0" w:before="0"/>
+        <w:ind w:left="160" w:right="160"/>
+      </w:pPr>
+      <w:r>
+        <w:rPr>
+          <w:rFonts w:ascii="Courier New" w:cs="Courier New" w:eastAsia="Courier New" w:hAnsi="Courier New"/>
+          <w:color w:val="D4D4D4"/>
+          <w:sz w:val="18"/>
+          <w:szCs w:val="18"/>
+        </w:rPr>
+        <w:t xml:space="preserve"># On GCP VM: pull embeddings from GCS</w:t>
+      </w:r>
+    </w:p>
+    <w:p>
+      <w:pPr>
+        <w:shd w:fill="1E1E1E" w:val="clear"/>
+        <w:spacing w:after="0" w:before="0"/>
+        <w:ind w:left="160" w:right="160"/>
+      </w:pPr>
+      <w:r>
+        <w:rPr>
+          <w:rFonts w:ascii="Courier New" w:cs="Courier New" w:eastAsia="Courier New" w:hAnsi="Courier New"/>
+          <w:color w:val="D4D4D4"/>
+          <w:sz w:val="18"/>
+          <w:szCs w:val="18"/>
+        </w:rPr>
+        <w:t xml:space="preserve">gcloud storage rsync -r \</w:t>
+      </w:r>
+    </w:p>
+    <w:p>
+      <w:pPr>
+        <w:shd w:fill="1E1E1E" w:val="clear"/>
+        <w:spacing w:after="0" w:before="0"/>
+        <w:ind w:left="160" w:right="160"/>
+      </w:pPr>
+      <w:r>
+        <w:rPr>
+          <w:rFonts w:ascii="Courier New" w:cs="Courier New" w:eastAsia="Courier New" w:hAnsi="Courier New"/>
+          <w:color w:val="D4D4D4"/>
+          <w:sz w:val="18"/>
+          <w:szCs w:val="18"/>
+        </w:rPr>
+        <w:t xml:space="preserve">    gs://sponsor-segment-skipper-cache/embeddings \</w:t>
+      </w:r>
+    </w:p>
+    <w:p>
+      <w:pPr>
+        <w:shd w:fill="1E1E1E" w:val="clear"/>
+        <w:spacing w:after="0" w:before="0"/>
+        <w:ind w:left="160" w:right="160"/>
+      </w:pPr>
+      <w:r>
+        <w:rPr>
+          <w:rFonts w:ascii="Courier New" w:cs="Courier New" w:eastAsia="Courier New" w:hAnsi="Courier New"/>
+          <w:color w:val="D4D4D4"/>
+          <w:sz w:val="18"/>
+          <w:szCs w:val="18"/>
+        </w:rPr>
+        <w:t xml:space="preserve">    training/cache/embeddings</w:t>
       </w:r>
     </w:p>
     <w:p>
@@ -1595,7 +1711,7 @@
           <w:sz w:val="22"/>
           <w:szCs w:val="22"/>
         </w:rPr>
-        <w:t xml:space="preserve">The dry run writes a generated </w:t>
+        <w:t xml:space="preserve">Then SSH into the VM (start it first if stopped: </w:t>
       </w:r>
       <w:r>
         <w:rPr>
@@ -1606,81 +1722,41 @@
           <w:sz w:val="20"/>
           <w:szCs w:val="20"/>
         </w:rPr>
-        <w:t xml:space="preserve"> .ipynb </w:t>
-      </w:r>
-      <w:r>
-        <w:rPr>
-          <w:rFonts w:ascii="Arial" w:cs="Arial" w:eastAsia="Arial" w:hAnsi="Arial"/>
-          <w:color w:val="1F2937"/>
-          <w:sz w:val="22"/>
-          <w:szCs w:val="22"/>
-        </w:rPr>
-        <w:t xml:space="preserve"> and </w:t>
-      </w:r>
-      <w:r>
-        <w:rPr>
-          <w:rFonts w:ascii="Courier New" w:cs="Courier New" w:eastAsia="Courier New" w:hAnsi="Courier New"/>
+        <w:t xml:space="preserve">gcloud compute instances start yt-sponsor-vm --zone asia-east1-c</w:t>
+      </w:r>
+      <w:r>
+        <w:rPr>
+          <w:rFonts w:ascii="Arial" w:cs="Arial" w:eastAsia="Arial" w:hAnsi="Arial"/>
+          <w:color w:val="1F2937"/>
+          <w:sz w:val="22"/>
+          <w:szCs w:val="22"/>
+        </w:rPr>
+        <w:t xml:space="preserve">) and run each phase directly with Python inside a tmux session so SSH disconnections do not interrupt training.</w:t>
+      </w:r>
+    </w:p>
+    <w:p>
+      <w:pPr>
+        <w:spacing w:after="80" w:before="0"/>
+      </w:pPr>
+      <w:r>
+        <w:t xml:space="preserve"/>
+      </w:r>
+    </w:p>
+    <w:p>
+      <w:pPr>
+        <w:pStyle w:val="Heading2"/>
+        <w:spacing w:after="100" w:before="280"/>
+      </w:pPr>
+      <w:r>
+        <w:rPr>
+          <w:rFonts w:ascii="Arial" w:cs="Arial" w:eastAsia="Arial" w:hAnsi="Arial"/>
           <w:b/>
           <w:bCs/>
-          <w:color w:val="7C3AED"/>
-          <w:sz w:val="20"/>
-          <w:szCs w:val="20"/>
-        </w:rPr>
-        <w:t xml:space="preserve"> kernel-metadata.json </w:t>
-      </w:r>
-      <w:r>
-        <w:rPr>
-          <w:rFonts w:ascii="Arial" w:cs="Arial" w:eastAsia="Arial" w:hAnsi="Arial"/>
-          <w:color w:val="1F2937"/>
-          <w:sz w:val="22"/>
-          <w:szCs w:val="22"/>
-        </w:rPr>
-        <w:t xml:space="preserve"> to </w:t>
-      </w:r>
-      <w:r>
-        <w:rPr>
-          <w:rFonts w:ascii="Courier New" w:cs="Courier New" w:eastAsia="Courier New" w:hAnsi="Courier New"/>
-          <w:b/>
-          <w:bCs/>
-          <w:color w:val="7C3AED"/>
-          <w:sz w:val="20"/>
-          <w:szCs w:val="20"/>
-        </w:rPr>
-        <w:t xml:space="preserve"> training/kaggle_outputs/dry_run/ </w:t>
-      </w:r>
-      <w:r>
-        <w:rPr>
-          <w:rFonts w:ascii="Arial" w:cs="Arial" w:eastAsia="Arial" w:hAnsi="Arial"/>
-          <w:color w:val="1F2937"/>
-          <w:sz w:val="22"/>
-          <w:szCs w:val="22"/>
-        </w:rPr>
-        <w:t xml:space="preserve"> so you can inspect the notebook before pushing.</w:t>
-      </w:r>
-    </w:p>
-    <w:p>
-      <w:pPr>
-        <w:spacing w:after="80" w:before="0"/>
-      </w:pPr>
-      <w:r>
-        <w:t xml:space="preserve"/>
-      </w:r>
-    </w:p>
-    <w:p>
-      <w:pPr>
-        <w:pStyle w:val="Heading2"/>
-        <w:spacing w:after="100" w:before="280"/>
-      </w:pPr>
-      <w:r>
-        <w:rPr>
-          <w:rFonts w:ascii="Arial" w:cs="Arial" w:eastAsia="Arial" w:hAnsi="Arial"/>
-          <w:b/>
-          <w:bCs/>
           <w:color w:val="1F2937"/>
           <w:sz w:val="28"/>
           <w:szCs w:val="28"/>
         </w:rPr>
-        <w:t xml:space="preserve">3.2  Phase 1 — Data collection</w:t>
+        <w:t xml:space="preserve">3.2  Phase 1 — Data collection (Mac)</w:t>
       </w:r>
     </w:p>
     <w:p>
@@ -1696,7 +1772,7 @@
           <w:sz w:val="18"/>
           <w:szCs w:val="18"/>
         </w:rPr>
-        <w:t xml:space="preserve">python training/kaggle_bridge.py \</w:t>
+        <w:t xml:space="preserve"># Run from the repo root on your Mac</w:t>
       </w:r>
     </w:p>
     <w:p>
@@ -1712,7 +1788,7 @@
           <w:sz w:val="18"/>
           <w:szCs w:val="18"/>
         </w:rPr>
-        <w:t xml:space="preserve">    --config training/configs/phase1_data.json \</w:t>
+        <w:t xml:space="preserve">python3 training/src/data_pipeline.py \</w:t>
       </w:r>
     </w:p>
     <w:p>
@@ -1728,7 +1804,7 @@
           <w:sz w:val="18"/>
           <w:szCs w:val="18"/>
         </w:rPr>
-        <w:t xml:space="preserve">    --gpu \</w:t>
+        <w:t xml:space="preserve">    --csv sponsorTimes.csv \</w:t>
       </w:r>
     </w:p>
     <w:p>
@@ -1744,7 +1820,71 @@
           <w:sz w:val="18"/>
           <w:szCs w:val="18"/>
         </w:rPr>
-        <w:t xml:space="preserve">    --upload-cache</w:t>
+        <w:t xml:space="preserve">    --out training/cache/embeddings \</w:t>
+      </w:r>
+    </w:p>
+    <w:p>
+      <w:pPr>
+        <w:shd w:fill="1E1E1E" w:val="clear"/>
+        <w:spacing w:after="0" w:before="0"/>
+        <w:ind w:left="160" w:right="160"/>
+      </w:pPr>
+      <w:r>
+        <w:rPr>
+          <w:rFonts w:ascii="Courier New" w:cs="Courier New" w:eastAsia="Courier New" w:hAnsi="Courier New"/>
+          <w:color w:val="D4D4D4"/>
+          <w:sz w:val="18"/>
+          <w:szCs w:val="18"/>
+        </w:rPr>
+        <w:t xml:space="preserve">    --videos 999999 \</w:t>
+      </w:r>
+    </w:p>
+    <w:p>
+      <w:pPr>
+        <w:shd w:fill="1E1E1E" w:val="clear"/>
+        <w:spacing w:after="0" w:before="0"/>
+        <w:ind w:left="160" w:right="160"/>
+      </w:pPr>
+      <w:r>
+        <w:rPr>
+          <w:rFonts w:ascii="Courier New" w:cs="Courier New" w:eastAsia="Courier New" w:hAnsi="Courier New"/>
+          <w:color w:val="D4D4D4"/>
+          <w:sz w:val="18"/>
+          <w:szCs w:val="18"/>
+        </w:rPr>
+        <w:t xml:space="preserve">    --device mps \</w:t>
+      </w:r>
+    </w:p>
+    <w:p>
+      <w:pPr>
+        <w:shd w:fill="1E1E1E" w:val="clear"/>
+        <w:spacing w:after="0" w:before="0"/>
+        <w:ind w:left="160" w:right="160"/>
+      </w:pPr>
+      <w:r>
+        <w:rPr>
+          <w:rFonts w:ascii="Courier New" w:cs="Courier New" w:eastAsia="Courier New" w:hAnsi="Courier New"/>
+          <w:color w:val="D4D4D4"/>
+          <w:sz w:val="18"/>
+          <w:szCs w:val="18"/>
+        </w:rPr>
+        <w:t xml:space="preserve">    --cookies cookies.txt \</w:t>
+      </w:r>
+    </w:p>
+    <w:p>
+      <w:pPr>
+        <w:shd w:fill="1E1E1E" w:val="clear"/>
+        <w:spacing w:after="0" w:before="0"/>
+        <w:ind w:left="160" w:right="160"/>
+      </w:pPr>
+      <w:r>
+        <w:rPr>
+          <w:rFonts w:ascii="Courier New" w:cs="Courier New" w:eastAsia="Courier New" w:hAnsi="Courier New"/>
+          <w:color w:val="D4D4D4"/>
+          <w:sz w:val="18"/>
+          <w:szCs w:val="18"/>
+        </w:rPr>
+        <w:t xml:space="preserve">    --sleep 2</w:t>
       </w:r>
     </w:p>
     <w:p>
@@ -1786,7 +1926,7 @@
           <w:sz w:val="22"/>
           <w:szCs w:val="22"/>
         </w:rPr>
-        <w:t xml:space="preserve">The kernel downloads </w:t>
+        <w:t xml:space="preserve">Reads </w:t>
       </w:r>
       <w:r>
         <w:rPr>
@@ -1797,16 +1937,16 @@
           <w:sz w:val="20"/>
           <w:szCs w:val="20"/>
         </w:rPr>
-        <w:t xml:space="preserve"> sponsorTimes.csv </w:t>
-      </w:r>
-      <w:r>
-        <w:rPr>
-          <w:rFonts w:ascii="Arial" w:cs="Arial" w:eastAsia="Arial" w:hAnsi="Arial"/>
-          <w:color w:val="1F2937"/>
-          <w:sz w:val="22"/>
-          <w:szCs w:val="22"/>
-        </w:rPr>
-        <w:t xml:space="preserve"> (~2–4 GB) from the SponsorBlock public mirror.</w:t>
+        <w:t xml:space="preserve">sponsorTimes.csv</w:t>
+      </w:r>
+      <w:r>
+        <w:rPr>
+          <w:rFonts w:ascii="Arial" w:cs="Arial" w:eastAsia="Arial" w:hAnsi="Arial"/>
+          <w:color w:val="1F2937"/>
+          <w:sz w:val="22"/>
+          <w:szCs w:val="22"/>
+        </w:rPr>
+        <w:t xml:space="preserve"> from the SponsorBlock mirror (download separately and place in the repo root).</w:t>
       </w:r>
     </w:p>
     <w:p>
@@ -1825,7 +1965,7 @@
           <w:sz w:val="22"/>
           <w:szCs w:val="22"/>
         </w:rPr>
-        <w:t xml:space="preserve">It samples 300 random videos (configurable via </w:t>
+        <w:t xml:space="preserve">For each video: fetches the audio stream with yt-dlp (using your cookies.txt for authentication), runs Whisper-tiny on Apple MPS for audio embeddings, runs DistilBERT on captions for text embeddings, and saves a </w:t>
       </w:r>
       <w:r>
         <w:rPr>
@@ -1836,16 +1976,16 @@
           <w:sz w:val="20"/>
           <w:szCs w:val="20"/>
         </w:rPr>
-        <w:t xml:space="preserve"> n_videos </w:t>
-      </w:r>
-      <w:r>
-        <w:rPr>
-          <w:rFonts w:ascii="Arial" w:cs="Arial" w:eastAsia="Arial" w:hAnsi="Arial"/>
-          <w:color w:val="1F2937"/>
-          <w:sz w:val="22"/>
-          <w:szCs w:val="22"/>
-        </w:rPr>
-        <w:t xml:space="preserve">), fetches captions and audio-only streams with yt-dlp, slices segments with ffmpeg, runs Whisper-tiny and DistilBERT, and saves a </w:t>
+        <w:t xml:space="preserve">.npz</w:t>
+      </w:r>
+      <w:r>
+        <w:rPr>
+          <w:rFonts w:ascii="Arial" w:cs="Arial" w:eastAsia="Arial" w:hAnsi="Arial"/>
+          <w:color w:val="1F2937"/>
+          <w:sz w:val="22"/>
+          <w:szCs w:val="22"/>
+        </w:rPr>
+        <w:t xml:space="preserve"> per video to </w:t>
       </w:r>
       <w:r>
         <w:rPr>
@@ -1856,16 +1996,16 @@
           <w:sz w:val="20"/>
           <w:szCs w:val="20"/>
         </w:rPr>
-        <w:t xml:space="preserve"> .npz </w:t>
-      </w:r>
-      <w:r>
-        <w:rPr>
-          <w:rFonts w:ascii="Arial" w:cs="Arial" w:eastAsia="Arial" w:hAnsi="Arial"/>
-          <w:color w:val="1F2937"/>
-          <w:sz w:val="22"/>
-          <w:szCs w:val="22"/>
-        </w:rPr>
-        <w:t xml:space="preserve"> per video.</w:t>
+        <w:t xml:space="preserve">training/cache/embeddings/</w:t>
+      </w:r>
+      <w:r>
+        <w:rPr>
+          <w:rFonts w:ascii="Arial" w:cs="Arial" w:eastAsia="Arial" w:hAnsi="Arial"/>
+          <w:color w:val="1F2937"/>
+          <w:sz w:val="22"/>
+          <w:szCs w:val="22"/>
+        </w:rPr>
+        <w:t xml:space="preserve">. Already-cached videos are skipped automatically.</w:t>
       </w:r>
     </w:p>
     <w:p>
@@ -1884,7 +2024,144 @@
           <w:sz w:val="22"/>
           <w:szCs w:val="22"/>
         </w:rPr>
-        <w:t xml:space="preserve">Outputs are fetched to </w:t>
+        <w:t xml:space="preserve">Run inside tmux so the pipeline survives terminal disconnections. Each video takes ~8 seconds on Mac with MPS.</w:t>
+      </w:r>
+    </w:p>
+    <w:p>
+      <w:pPr>
+        <w:spacing w:after="80" w:before="0"/>
+      </w:pPr>
+      <w:r>
+        <w:t xml:space="preserve"/>
+      </w:r>
+    </w:p>
+    <w:p>
+      <w:pPr>
+        <w:spacing w:after="100" w:before="0"/>
+        <w:jc w:val="left"/>
+      </w:pPr>
+      <w:r>
+        <w:rPr>
+          <w:rFonts w:ascii="Arial" w:cs="Arial" w:eastAsia="Arial" w:hAnsi="Arial"/>
+          <w:i/>
+          <w:iCs/>
+          <w:color w:val="6B7280"/>
+          <w:sz w:val="22"/>
+          <w:szCs w:val="22"/>
+        </w:rPr>
+        <w:t xml:space="preserve">Tip: the script is resumable. If it is interrupted, rerun the same command and it will skip already-cached videos. When finished, sync the cache to GCS (see Section 3.1) before moving to the GCP VM.</w:t>
+      </w:r>
+    </w:p>
+    <w:p>
+      <w:pPr>
+        <w:spacing w:after="80" w:before="0"/>
+      </w:pPr>
+      <w:r>
+        <w:t xml:space="preserve"/>
+      </w:r>
+    </w:p>
+    <w:p>
+      <w:pPr>
+        <w:pStyle w:val="Heading2"/>
+        <w:spacing w:after="100" w:before="280"/>
+      </w:pPr>
+      <w:r>
+        <w:rPr>
+          <w:rFonts w:ascii="Arial" w:cs="Arial" w:eastAsia="Arial" w:hAnsi="Arial"/>
+          <w:b/>
+          <w:bCs/>
+          <w:color w:val="1F2937"/>
+          <w:sz w:val="28"/>
+          <w:szCs w:val="28"/>
+        </w:rPr>
+        <w:t xml:space="preserve">3.3  Phase 2 — Baseline (optional)</w:t>
+      </w:r>
+    </w:p>
+    <w:p>
+      <w:pPr>
+        <w:shd w:fill="1E1E1E" w:val="clear"/>
+        <w:spacing w:after="0" w:before="0"/>
+        <w:ind w:left="160" w:right="160"/>
+      </w:pPr>
+      <w:r>
+        <w:rPr>
+          <w:rFonts w:ascii="Courier New" w:cs="Courier New" w:eastAsia="Courier New" w:hAnsi="Courier New"/>
+          <w:color w:val="D4D4D4"/>
+          <w:sz w:val="18"/>
+          <w:szCs w:val="18"/>
+        </w:rPr>
+        <w:t xml:space="preserve"># Run on GCP VM (no GPU needed)</w:t>
+      </w:r>
+    </w:p>
+    <w:p>
+      <w:pPr>
+        <w:shd w:fill="1E1E1E" w:val="clear"/>
+        <w:spacing w:after="0" w:before="0"/>
+        <w:ind w:left="160" w:right="160"/>
+      </w:pPr>
+      <w:r>
+        <w:rPr>
+          <w:rFonts w:ascii="Courier New" w:cs="Courier New" w:eastAsia="Courier New" w:hAnsi="Courier New"/>
+          <w:color w:val="D4D4D4"/>
+          <w:sz w:val="18"/>
+          <w:szCs w:val="18"/>
+        </w:rPr>
+        <w:t xml:space="preserve">python3 training/src/baseline.py \</w:t>
+      </w:r>
+    </w:p>
+    <w:p>
+      <w:pPr>
+        <w:shd w:fill="1E1E1E" w:val="clear"/>
+        <w:spacing w:after="0" w:before="0"/>
+        <w:ind w:left="160" w:right="160"/>
+      </w:pPr>
+      <w:r>
+        <w:rPr>
+          <w:rFonts w:ascii="Courier New" w:cs="Courier New" w:eastAsia="Courier New" w:hAnsi="Courier New"/>
+          <w:color w:val="D4D4D4"/>
+          <w:sz w:val="18"/>
+          <w:szCs w:val="18"/>
+        </w:rPr>
+        <w:t xml:space="preserve">    --data training/cache/embeddings \</w:t>
+      </w:r>
+    </w:p>
+    <w:p>
+      <w:pPr>
+        <w:shd w:fill="1E1E1E" w:val="clear"/>
+        <w:spacing w:after="0" w:before="0"/>
+        <w:ind w:left="160" w:right="160"/>
+      </w:pPr>
+      <w:r>
+        <w:rPr>
+          <w:rFonts w:ascii="Courier New" w:cs="Courier New" w:eastAsia="Courier New" w:hAnsi="Courier New"/>
+          <w:color w:val="D4D4D4"/>
+          <w:sz w:val="18"/>
+          <w:szCs w:val="18"/>
+        </w:rPr>
+        <w:t xml:space="preserve">    --out training/outputs/baseline</w:t>
+      </w:r>
+    </w:p>
+    <w:p>
+      <w:pPr>
+        <w:spacing w:after="80" w:before="0"/>
+      </w:pPr>
+      <w:r>
+        <w:t xml:space="preserve"/>
+      </w:r>
+    </w:p>
+    <w:p>
+      <w:pPr>
+        <w:spacing w:after="100" w:before="0"/>
+        <w:jc w:val="left"/>
+      </w:pPr>
+      <w:r>
+        <w:rPr>
+          <w:rFonts w:ascii="Arial" w:cs="Arial" w:eastAsia="Arial" w:hAnsi="Arial"/>
+          <w:color w:val="1F2937"/>
+          <w:sz w:val="22"/>
+          <w:szCs w:val="22"/>
+        </w:rPr>
+        <w:t xml:space="preserve">Evaluates the keyword heuristic on the held-out test split. Results are written to </w:t>
       </w:r>
       <w:r>
         <w:rPr>
@@ -1895,16 +2172,256 @@
           <w:sz w:val="20"/>
           <w:szCs w:val="20"/>
         </w:rPr>
-        <w:t xml:space="preserve"> training/outputs/data/ </w:t>
-      </w:r>
-      <w:r>
-        <w:rPr>
-          <w:rFonts w:ascii="Arial" w:cs="Arial" w:eastAsia="Arial" w:hAnsi="Arial"/>
-          <w:color w:val="1F2937"/>
-          <w:sz w:val="22"/>
-          <w:szCs w:val="22"/>
-        </w:rPr>
-        <w:t xml:space="preserve">.</w:t>
+        <w:t xml:space="preserve"> training_log.json </w:t>
+      </w:r>
+      <w:r>
+        <w:rPr>
+          <w:rFonts w:ascii="Arial" w:cs="Arial" w:eastAsia="Arial" w:hAnsi="Arial"/>
+          <w:color w:val="1F2937"/>
+          <w:sz w:val="22"/>
+          <w:szCs w:val="22"/>
+        </w:rPr>
+        <w:t xml:space="preserve"> and routed locally to </w:t>
+      </w:r>
+      <w:r>
+        <w:rPr>
+          <w:rFonts w:ascii="Courier New" w:cs="Courier New" w:eastAsia="Courier New" w:hAnsi="Courier New"/>
+          <w:b/>
+          <w:bCs/>
+          <w:color w:val="7C3AED"/>
+          <w:sz w:val="20"/>
+          <w:szCs w:val="20"/>
+        </w:rPr>
+        <w:t xml:space="preserve"> training/outputs/baseline/ </w:t>
+      </w:r>
+      <w:r>
+        <w:rPr>
+          <w:rFonts w:ascii="Arial" w:cs="Arial" w:eastAsia="Arial" w:hAnsi="Arial"/>
+          <w:color w:val="1F2937"/>
+          <w:sz w:val="22"/>
+          <w:szCs w:val="22"/>
+        </w:rPr>
+        <w:t xml:space="preserve">. No GPU needed.</w:t>
+      </w:r>
+    </w:p>
+    <w:p>
+      <w:pPr>
+        <w:spacing w:after="80" w:before="0"/>
+      </w:pPr>
+      <w:r>
+        <w:t xml:space="preserve"/>
+      </w:r>
+    </w:p>
+    <w:p>
+      <w:pPr>
+        <w:pStyle w:val="Heading2"/>
+        <w:spacing w:after="100" w:before="280"/>
+      </w:pPr>
+      <w:r>
+        <w:rPr>
+          <w:rFonts w:ascii="Arial" w:cs="Arial" w:eastAsia="Arial" w:hAnsi="Arial"/>
+          <w:b/>
+          <w:bCs/>
+          <w:color w:val="1F2937"/>
+          <w:sz w:val="28"/>
+          <w:szCs w:val="28"/>
+        </w:rPr>
+        <w:t xml:space="preserve">3.4  Phase 3 — Teacher training (GCP VM)</w:t>
+      </w:r>
+    </w:p>
+    <w:p>
+      <w:pPr>
+        <w:shd w:fill="1E1E1E" w:val="clear"/>
+        <w:spacing w:after="0" w:before="0"/>
+        <w:ind w:left="160" w:right="160"/>
+      </w:pPr>
+      <w:r>
+        <w:rPr>
+          <w:rFonts w:ascii="Courier New" w:cs="Courier New" w:eastAsia="Courier New" w:hAnsi="Courier New"/>
+          <w:color w:val="D4D4D4"/>
+          <w:sz w:val="18"/>
+          <w:szCs w:val="18"/>
+        </w:rPr>
+        <w:t xml:space="preserve"># Step 1: hyperparameter search (20 Optuna trials, resumes on restart)</w:t>
+      </w:r>
+    </w:p>
+    <w:p>
+      <w:pPr>
+        <w:shd w:fill="1E1E1E" w:val="clear"/>
+        <w:spacing w:after="0" w:before="0"/>
+        <w:ind w:left="160" w:right="160"/>
+      </w:pPr>
+      <w:r>
+        <w:rPr>
+          <w:rFonts w:ascii="Courier New" w:cs="Courier New" w:eastAsia="Courier New" w:hAnsi="Courier New"/>
+          <w:color w:val="D4D4D4"/>
+          <w:sz w:val="18"/>
+          <w:szCs w:val="18"/>
+        </w:rPr>
+        <w:t xml:space="preserve">python3 training/src/tune.py \</w:t>
+      </w:r>
+    </w:p>
+    <w:p>
+      <w:pPr>
+        <w:shd w:fill="1E1E1E" w:val="clear"/>
+        <w:spacing w:after="0" w:before="0"/>
+        <w:ind w:left="160" w:right="160"/>
+      </w:pPr>
+      <w:r>
+        <w:rPr>
+          <w:rFonts w:ascii="Courier New" w:cs="Courier New" w:eastAsia="Courier New" w:hAnsi="Courier New"/>
+          <w:color w:val="D4D4D4"/>
+          <w:sz w:val="18"/>
+          <w:szCs w:val="18"/>
+        </w:rPr>
+        <w:t xml:space="preserve">    --config training/configs/phase3_tune.json \</w:t>
+      </w:r>
+    </w:p>
+    <w:p>
+      <w:pPr>
+        <w:shd w:fill="1E1E1E" w:val="clear"/>
+        <w:spacing w:after="0" w:before="0"/>
+        <w:ind w:left="160" w:right="160"/>
+      </w:pPr>
+      <w:r>
+        <w:rPr>
+          <w:rFonts w:ascii="Courier New" w:cs="Courier New" w:eastAsia="Courier New" w:hAnsi="Courier New"/>
+          <w:color w:val="D4D4D4"/>
+          <w:sz w:val="18"/>
+          <w:szCs w:val="18"/>
+        </w:rPr>
+        <w:t xml:space="preserve">    --data training/cache/embeddings</w:t>
+      </w:r>
+    </w:p>
+    <w:p>
+      <w:pPr>
+        <w:shd w:fill="1E1E1E" w:val="clear"/>
+        <w:spacing w:after="0" w:before="0"/>
+        <w:ind w:left="160" w:right="160"/>
+      </w:pPr>
+      <w:r>
+        <w:rPr>
+          <w:rFonts w:ascii="Courier New" w:cs="Courier New" w:eastAsia="Courier New" w:hAnsi="Courier New"/>
+          <w:color w:val="D4D4D4"/>
+          <w:sz w:val="18"/>
+          <w:szCs w:val="18"/>
+        </w:rPr>
+        <w:t xml:space="preserve"/>
+      </w:r>
+    </w:p>
+    <w:p>
+      <w:pPr>
+        <w:shd w:fill="1E1E1E" w:val="clear"/>
+        <w:spacing w:after="0" w:before="0"/>
+        <w:ind w:left="160" w:right="160"/>
+      </w:pPr>
+      <w:r>
+        <w:rPr>
+          <w:rFonts w:ascii="Courier New" w:cs="Courier New" w:eastAsia="Courier New" w:hAnsi="Courier New"/>
+          <w:color w:val="D4D4D4"/>
+          <w:sz w:val="18"/>
+          <w:szCs w:val="18"/>
+        </w:rPr>
+        <w:t xml:space="preserve"># Step 2: full teacher training with best hyperparameters</w:t>
+      </w:r>
+    </w:p>
+    <w:p>
+      <w:pPr>
+        <w:shd w:fill="1E1E1E" w:val="clear"/>
+        <w:spacing w:after="0" w:before="0"/>
+        <w:ind w:left="160" w:right="160"/>
+      </w:pPr>
+      <w:r>
+        <w:rPr>
+          <w:rFonts w:ascii="Courier New" w:cs="Courier New" w:eastAsia="Courier New" w:hAnsi="Courier New"/>
+          <w:color w:val="D4D4D4"/>
+          <w:sz w:val="18"/>
+          <w:szCs w:val="18"/>
+        </w:rPr>
+        <w:t xml:space="preserve">python3 training/src/train.py \</w:t>
+      </w:r>
+    </w:p>
+    <w:p>
+      <w:pPr>
+        <w:shd w:fill="1E1E1E" w:val="clear"/>
+        <w:spacing w:after="0" w:before="0"/>
+        <w:ind w:left="160" w:right="160"/>
+      </w:pPr>
+      <w:r>
+        <w:rPr>
+          <w:rFonts w:ascii="Courier New" w:cs="Courier New" w:eastAsia="Courier New" w:hAnsi="Courier New"/>
+          <w:color w:val="D4D4D4"/>
+          <w:sz w:val="18"/>
+          <w:szCs w:val="18"/>
+        </w:rPr>
+        <w:t xml:space="preserve">    --config training/configs/phase3_teacher.json \</w:t>
+      </w:r>
+    </w:p>
+    <w:p>
+      <w:pPr>
+        <w:shd w:fill="1E1E1E" w:val="clear"/>
+        <w:spacing w:after="0" w:before="0"/>
+        <w:ind w:left="160" w:right="160"/>
+      </w:pPr>
+      <w:r>
+        <w:rPr>
+          <w:rFonts w:ascii="Courier New" w:cs="Courier New" w:eastAsia="Courier New" w:hAnsi="Courier New"/>
+          <w:color w:val="D4D4D4"/>
+          <w:sz w:val="18"/>
+          <w:szCs w:val="18"/>
+        </w:rPr>
+        <w:t xml:space="preserve">    --data training/cache/embeddings</w:t>
+      </w:r>
+    </w:p>
+    <w:p>
+      <w:pPr>
+        <w:spacing w:after="80" w:before="0"/>
+      </w:pPr>
+      <w:r>
+        <w:t xml:space="preserve"/>
+      </w:r>
+    </w:p>
+    <w:p>
+      <w:pPr>
+        <w:spacing w:after="100" w:before="0"/>
+        <w:jc w:val="left"/>
+      </w:pPr>
+      <w:r>
+        <w:rPr>
+          <w:rFonts w:ascii="Arial" w:cs="Arial" w:eastAsia="Arial" w:hAnsi="Arial"/>
+          <w:color w:val="1F2937"/>
+          <w:sz w:val="22"/>
+          <w:szCs w:val="22"/>
+        </w:rPr>
+        <w:t xml:space="preserve">Trains the TeacherModel for up to 30 epochs with early stopping (patience=5). A </w:t>
+      </w:r>
+      <w:r>
+        <w:rPr>
+          <w:rFonts w:ascii="Courier New" w:cs="Courier New" w:eastAsia="Courier New" w:hAnsi="Courier New"/>
+          <w:b/>
+          <w:bCs/>
+          <w:color w:val="7C3AED"/>
+          <w:sz w:val="20"/>
+          <w:szCs w:val="20"/>
+        </w:rPr>
+        <w:t xml:space="preserve"> ReduceLROnPlateau </w:t>
+      </w:r>
+      <w:r>
+        <w:rPr>
+          <w:rFonts w:ascii="Arial" w:cs="Arial" w:eastAsia="Arial" w:hAnsi="Arial"/>
+          <w:color w:val="1F2937"/>
+          <w:sz w:val="22"/>
+          <w:szCs w:val="22"/>
+        </w:rPr>
+        <w:t xml:space="preserve"> scheduler halves the LR if validation loss stalls for 3 epochs.</w:t>
+      </w:r>
+    </w:p>
+    <w:p>
+      <w:pPr>
+        <w:spacing w:after="80" w:before="0"/>
+      </w:pPr>
+      <w:r>
+        <w:t xml:space="preserve"/>
       </w:r>
     </w:p>
     <w:p>
@@ -1923,7 +2440,7 @@
           <w:sz w:val="22"/>
           <w:szCs w:val="22"/>
         </w:rPr>
-        <w:t xml:space="preserve">With </w:t>
+        <w:t xml:space="preserve">Outputs: </w:t>
       </w:r>
       <w:r>
         <w:rPr>
@@ -1934,16 +2451,16 @@
           <w:sz w:val="20"/>
           <w:szCs w:val="20"/>
         </w:rPr>
-        <w:t xml:space="preserve"> --upload-cache </w:t>
-      </w:r>
-      <w:r>
-        <w:rPr>
-          <w:rFonts w:ascii="Arial" w:cs="Arial" w:eastAsia="Arial" w:hAnsi="Arial"/>
-          <w:color w:val="1F2937"/>
-          <w:sz w:val="22"/>
-          <w:szCs w:val="22"/>
-        </w:rPr>
-        <w:t xml:space="preserve">, the </w:t>
+        <w:t xml:space="preserve"> teacher_best.pt </w:t>
+      </w:r>
+      <w:r>
+        <w:rPr>
+          <w:rFonts w:ascii="Arial" w:cs="Arial" w:eastAsia="Arial" w:hAnsi="Arial"/>
+          <w:color w:val="1F2937"/>
+          <w:sz w:val="22"/>
+          <w:szCs w:val="22"/>
+        </w:rPr>
+        <w:t xml:space="preserve"> + </w:t>
       </w:r>
       <w:r>
         <w:rPr>
@@ -1954,16 +2471,16 @@
           <w:sz w:val="20"/>
           <w:szCs w:val="20"/>
         </w:rPr>
-        <w:t xml:space="preserve"> .npz </w:t>
-      </w:r>
-      <w:r>
-        <w:rPr>
-          <w:rFonts w:ascii="Arial" w:cs="Arial" w:eastAsia="Arial" w:hAnsi="Arial"/>
-          <w:color w:val="1F2937"/>
-          <w:sz w:val="22"/>
-          <w:szCs w:val="22"/>
-        </w:rPr>
-        <w:t xml:space="preserve"> files are uploaded to a Kaggle Dataset (</w:t>
+        <w:t xml:space="preserve"> training_log.json </w:t>
+      </w:r>
+      <w:r>
+        <w:rPr>
+          <w:rFonts w:ascii="Arial" w:cs="Arial" w:eastAsia="Arial" w:hAnsi="Arial"/>
+          <w:color w:val="1F2937"/>
+          <w:sz w:val="22"/>
+          <w:szCs w:val="22"/>
+        </w:rPr>
+        <w:t xml:space="preserve"> → </w:t>
       </w:r>
       <w:r>
         <w:rPr>
@@ -1974,323 +2491,7 @@
           <w:sz w:val="20"/>
           <w:szCs w:val="20"/>
         </w:rPr>
-        <w:t xml:space="preserve"> yt-sponsor-embeddings-cache </w:t>
-      </w:r>
-      <w:r>
-        <w:rPr>
-          <w:rFonts w:ascii="Arial" w:cs="Arial" w:eastAsia="Arial" w:hAnsi="Arial"/>
-          <w:color w:val="1F2937"/>
-          <w:sz w:val="22"/>
-          <w:szCs w:val="22"/>
-        </w:rPr>
-        <w:t xml:space="preserve">) for subsequent phases to mount.</w:t>
-      </w:r>
-    </w:p>
-    <w:p>
-      <w:pPr>
-        <w:spacing w:after="80" w:before="0"/>
-      </w:pPr>
-      <w:r>
-        <w:t xml:space="preserve"/>
-      </w:r>
-    </w:p>
-    <w:p>
-      <w:pPr>
-        <w:spacing w:after="100" w:before="0"/>
-        <w:jc w:val="left"/>
-      </w:pPr>
-      <w:r>
-        <w:rPr>
-          <w:rFonts w:ascii="Arial" w:cs="Arial" w:eastAsia="Arial" w:hAnsi="Arial"/>
-          <w:i/>
-          <w:iCs/>
-          <w:color w:val="6B7280"/>
-          <w:sz w:val="22"/>
-          <w:szCs w:val="22"/>
-        </w:rPr>
-        <w:t xml:space="preserve">Tip: use </w:t>
-      </w:r>
-      <w:r>
-        <w:rPr>
-          <w:rFonts w:ascii="Courier New" w:cs="Courier New" w:eastAsia="Courier New" w:hAnsi="Courier New"/>
-          <w:b/>
-          <w:bCs/>
-          <w:color w:val="7C3AED"/>
-          <w:sz w:val="20"/>
-          <w:szCs w:val="20"/>
-        </w:rPr>
-        <w:t xml:space="preserve"> "skip_audio": true </w:t>
-      </w:r>
-      <w:r>
-        <w:rPr>
-          <w:rFonts w:ascii="Arial" w:cs="Arial" w:eastAsia="Arial" w:hAnsi="Arial"/>
-          <w:i/>
-          <w:iCs/>
-          <w:color w:val="6B7280"/>
-          <w:sz w:val="22"/>
-          <w:szCs w:val="22"/>
-        </w:rPr>
-        <w:t xml:space="preserve"> in phase1_data.json for a fast text-only test run (≲1 hour instead of 6+).</w:t>
-      </w:r>
-    </w:p>
-    <w:p>
-      <w:pPr>
-        <w:spacing w:after="80" w:before="0"/>
-      </w:pPr>
-      <w:r>
-        <w:t xml:space="preserve"/>
-      </w:r>
-    </w:p>
-    <w:p>
-      <w:pPr>
-        <w:pStyle w:val="Heading2"/>
-        <w:spacing w:after="100" w:before="280"/>
-      </w:pPr>
-      <w:r>
-        <w:rPr>
-          <w:rFonts w:ascii="Arial" w:cs="Arial" w:eastAsia="Arial" w:hAnsi="Arial"/>
-          <w:b/>
-          <w:bCs/>
-          <w:color w:val="1F2937"/>
-          <w:sz w:val="28"/>
-          <w:szCs w:val="28"/>
-        </w:rPr>
-        <w:t xml:space="preserve">3.3  Phase 2 — Baseline</w:t>
-      </w:r>
-    </w:p>
-    <w:p>
-      <w:pPr>
-        <w:shd w:fill="1E1E1E" w:val="clear"/>
-        <w:spacing w:after="0" w:before="0"/>
-        <w:ind w:left="160" w:right="160"/>
-      </w:pPr>
-      <w:r>
-        <w:rPr>
-          <w:rFonts w:ascii="Courier New" w:cs="Courier New" w:eastAsia="Courier New" w:hAnsi="Courier New"/>
-          <w:color w:val="D4D4D4"/>
-          <w:sz w:val="18"/>
-          <w:szCs w:val="18"/>
-        </w:rPr>
-        <w:t xml:space="preserve">python training/kaggle_bridge.py \</w:t>
-      </w:r>
-    </w:p>
-    <w:p>
-      <w:pPr>
-        <w:shd w:fill="1E1E1E" w:val="clear"/>
-        <w:spacing w:after="0" w:before="0"/>
-        <w:ind w:left="160" w:right="160"/>
-      </w:pPr>
-      <w:r>
-        <w:rPr>
-          <w:rFonts w:ascii="Courier New" w:cs="Courier New" w:eastAsia="Courier New" w:hAnsi="Courier New"/>
-          <w:color w:val="D4D4D4"/>
-          <w:sz w:val="18"/>
-          <w:szCs w:val="18"/>
-        </w:rPr>
-        <w:t xml:space="preserve">    --config training/configs/phase2_baseline.json</w:t>
-      </w:r>
-    </w:p>
-    <w:p>
-      <w:pPr>
-        <w:spacing w:after="80" w:before="0"/>
-      </w:pPr>
-      <w:r>
-        <w:t xml:space="preserve"/>
-      </w:r>
-    </w:p>
-    <w:p>
-      <w:pPr>
-        <w:spacing w:after="100" w:before="0"/>
-        <w:jc w:val="left"/>
-      </w:pPr>
-      <w:r>
-        <w:rPr>
-          <w:rFonts w:ascii="Arial" w:cs="Arial" w:eastAsia="Arial" w:hAnsi="Arial"/>
-          <w:color w:val="1F2937"/>
-          <w:sz w:val="22"/>
-          <w:szCs w:val="22"/>
-        </w:rPr>
-        <w:t xml:space="preserve">Evaluates the keyword heuristic on the held-out test split. Results are written to </w:t>
-      </w:r>
-      <w:r>
-        <w:rPr>
-          <w:rFonts w:ascii="Courier New" w:cs="Courier New" w:eastAsia="Courier New" w:hAnsi="Courier New"/>
-          <w:b/>
-          <w:bCs/>
-          <w:color w:val="7C3AED"/>
-          <w:sz w:val="20"/>
-          <w:szCs w:val="20"/>
-        </w:rPr>
-        <w:t xml:space="preserve"> training_log.json </w:t>
-      </w:r>
-      <w:r>
-        <w:rPr>
-          <w:rFonts w:ascii="Arial" w:cs="Arial" w:eastAsia="Arial" w:hAnsi="Arial"/>
-          <w:color w:val="1F2937"/>
-          <w:sz w:val="22"/>
-          <w:szCs w:val="22"/>
-        </w:rPr>
-        <w:t xml:space="preserve"> and routed locally to </w:t>
-      </w:r>
-      <w:r>
-        <w:rPr>
-          <w:rFonts w:ascii="Courier New" w:cs="Courier New" w:eastAsia="Courier New" w:hAnsi="Courier New"/>
-          <w:b/>
-          <w:bCs/>
-          <w:color w:val="7C3AED"/>
-          <w:sz w:val="20"/>
-          <w:szCs w:val="20"/>
-        </w:rPr>
-        <w:t xml:space="preserve"> training/outputs/baseline/ </w:t>
-      </w:r>
-      <w:r>
-        <w:rPr>
-          <w:rFonts w:ascii="Arial" w:cs="Arial" w:eastAsia="Arial" w:hAnsi="Arial"/>
-          <w:color w:val="1F2937"/>
-          <w:sz w:val="22"/>
-          <w:szCs w:val="22"/>
-        </w:rPr>
-        <w:t xml:space="preserve">. No GPU needed.</w:t>
-      </w:r>
-    </w:p>
-    <w:p>
-      <w:pPr>
-        <w:spacing w:after="80" w:before="0"/>
-      </w:pPr>
-      <w:r>
-        <w:t xml:space="preserve"/>
-      </w:r>
-    </w:p>
-    <w:p>
-      <w:pPr>
-        <w:pStyle w:val="Heading2"/>
-        <w:spacing w:after="100" w:before="280"/>
-      </w:pPr>
-      <w:r>
-        <w:rPr>
-          <w:rFonts w:ascii="Arial" w:cs="Arial" w:eastAsia="Arial" w:hAnsi="Arial"/>
-          <w:b/>
-          <w:bCs/>
-          <w:color w:val="1F2937"/>
-          <w:sz w:val="28"/>
-          <w:szCs w:val="28"/>
-        </w:rPr>
-        <w:t xml:space="preserve">3.4  Phase 3 — Teacher training</w:t>
-      </w:r>
-    </w:p>
-    <w:p>
-      <w:pPr>
-        <w:shd w:fill="1E1E1E" w:val="clear"/>
-        <w:spacing w:after="0" w:before="0"/>
-        <w:ind w:left="160" w:right="160"/>
-      </w:pPr>
-      <w:r>
-        <w:rPr>
-          <w:rFonts w:ascii="Courier New" w:cs="Courier New" w:eastAsia="Courier New" w:hAnsi="Courier New"/>
-          <w:color w:val="D4D4D4"/>
-          <w:sz w:val="18"/>
-          <w:szCs w:val="18"/>
-        </w:rPr>
-        <w:t xml:space="preserve">python training/kaggle_bridge.py \</w:t>
-      </w:r>
-    </w:p>
-    <w:p>
-      <w:pPr>
-        <w:shd w:fill="1E1E1E" w:val="clear"/>
-        <w:spacing w:after="0" w:before="0"/>
-        <w:ind w:left="160" w:right="160"/>
-      </w:pPr>
-      <w:r>
-        <w:rPr>
-          <w:rFonts w:ascii="Courier New" w:cs="Courier New" w:eastAsia="Courier New" w:hAnsi="Courier New"/>
-          <w:color w:val="D4D4D4"/>
-          <w:sz w:val="18"/>
-          <w:szCs w:val="18"/>
-        </w:rPr>
-        <w:t xml:space="preserve">    --config training/configs/phase3_teacher.json \</w:t>
-      </w:r>
-    </w:p>
-    <w:p>
-      <w:pPr>
-        <w:shd w:fill="1E1E1E" w:val="clear"/>
-        <w:spacing w:after="0" w:before="0"/>
-        <w:ind w:left="160" w:right="160"/>
-      </w:pPr>
-      <w:r>
-        <w:rPr>
-          <w:rFonts w:ascii="Courier New" w:cs="Courier New" w:eastAsia="Courier New" w:hAnsi="Courier New"/>
-          <w:color w:val="D4D4D4"/>
-          <w:sz w:val="18"/>
-          <w:szCs w:val="18"/>
-        </w:rPr>
-        <w:t xml:space="preserve">    --gpu \</w:t>
-      </w:r>
-    </w:p>
-    <w:p>
-      <w:pPr>
-        <w:shd w:fill="1E1E1E" w:val="clear"/>
-        <w:spacing w:after="0" w:before="0"/>
-        <w:ind w:left="160" w:right="160"/>
-      </w:pPr>
-      <w:r>
-        <w:rPr>
-          <w:rFonts w:ascii="Courier New" w:cs="Courier New" w:eastAsia="Courier New" w:hAnsi="Courier New"/>
-          <w:color w:val="D4D4D4"/>
-          <w:sz w:val="18"/>
-          <w:szCs w:val="18"/>
-        </w:rPr>
-        <w:t xml:space="preserve">    --upload-teacher-ckpt</w:t>
-      </w:r>
-    </w:p>
-    <w:p>
-      <w:pPr>
-        <w:spacing w:after="80" w:before="0"/>
-      </w:pPr>
-      <w:r>
-        <w:t xml:space="preserve"/>
-      </w:r>
-    </w:p>
-    <w:p>
-      <w:pPr>
-        <w:spacing w:after="100" w:before="0"/>
-        <w:jc w:val="left"/>
-      </w:pPr>
-      <w:r>
-        <w:rPr>
-          <w:rFonts w:ascii="Arial" w:cs="Arial" w:eastAsia="Arial" w:hAnsi="Arial"/>
-          <w:color w:val="1F2937"/>
-          <w:sz w:val="22"/>
-          <w:szCs w:val="22"/>
-        </w:rPr>
-        <w:t xml:space="preserve">Trains the TeacherModel for up to 30 epochs with early stopping (patience=5). A </w:t>
-      </w:r>
-      <w:r>
-        <w:rPr>
-          <w:rFonts w:ascii="Courier New" w:cs="Courier New" w:eastAsia="Courier New" w:hAnsi="Courier New"/>
-          <w:b/>
-          <w:bCs/>
-          <w:color w:val="7C3AED"/>
-          <w:sz w:val="20"/>
-          <w:szCs w:val="20"/>
-        </w:rPr>
-        <w:t xml:space="preserve"> ReduceLROnPlateau </w:t>
-      </w:r>
-      <w:r>
-        <w:rPr>
-          <w:rFonts w:ascii="Arial" w:cs="Arial" w:eastAsia="Arial" w:hAnsi="Arial"/>
-          <w:color w:val="1F2937"/>
-          <w:sz w:val="22"/>
-          <w:szCs w:val="22"/>
-        </w:rPr>
-        <w:t xml:space="preserve"> scheduler halves the LR if validation loss stalls for 3 epochs.</w:t>
-      </w:r>
-    </w:p>
-    <w:p>
-      <w:pPr>
-        <w:spacing w:after="80" w:before="0"/>
-      </w:pPr>
-      <w:r>
-        <w:t xml:space="preserve"/>
+        <w:t xml:space="preserve"> training/outputs/teacher/ </w:t>
       </w:r>
     </w:p>
     <w:p>
@@ -2309,7 +2510,7 @@
           <w:sz w:val="22"/>
           <w:szCs w:val="22"/>
         </w:rPr>
-        <w:t xml:space="preserve">Outputs: </w:t>
+        <w:t xml:space="preserve">Output: </w:t>
       </w:r>
       <w:r>
         <w:rPr>
@@ -2320,16 +2521,16 @@
           <w:sz w:val="20"/>
           <w:szCs w:val="20"/>
         </w:rPr>
-        <w:t xml:space="preserve"> teacher_best.pt </w:t>
-      </w:r>
-      <w:r>
-        <w:rPr>
-          <w:rFonts w:ascii="Arial" w:cs="Arial" w:eastAsia="Arial" w:hAnsi="Arial"/>
-          <w:color w:val="1F2937"/>
-          <w:sz w:val="22"/>
-          <w:szCs w:val="22"/>
-        </w:rPr>
-        <w:t xml:space="preserve"> + </w:t>
+        <w:t xml:space="preserve">teacher_best.pt</w:t>
+      </w:r>
+      <w:r>
+        <w:rPr>
+          <w:rFonts w:ascii="Arial" w:cs="Arial" w:eastAsia="Arial" w:hAnsi="Arial"/>
+          <w:color w:val="1F2937"/>
+          <w:sz w:val="22"/>
+          <w:szCs w:val="22"/>
+        </w:rPr>
+        <w:t xml:space="preserve"> is saved to </w:t>
       </w:r>
       <w:r>
         <w:rPr>
@@ -2340,27 +2541,128 @@
           <w:sz w:val="20"/>
           <w:szCs w:val="20"/>
         </w:rPr>
-        <w:t xml:space="preserve"> training_log.json </w:t>
-      </w:r>
-      <w:r>
-        <w:rPr>
-          <w:rFonts w:ascii="Arial" w:cs="Arial" w:eastAsia="Arial" w:hAnsi="Arial"/>
-          <w:color w:val="1F2937"/>
-          <w:sz w:val="22"/>
-          <w:szCs w:val="22"/>
-        </w:rPr>
-        <w:t xml:space="preserve"> → </w:t>
-      </w:r>
-      <w:r>
-        <w:rPr>
-          <w:rFonts w:ascii="Courier New" w:cs="Courier New" w:eastAsia="Courier New" w:hAnsi="Courier New"/>
+        <w:t xml:space="preserve">training/outputs/teacher/</w:t>
+      </w:r>
+      <w:r>
+        <w:rPr>
+          <w:rFonts w:ascii="Arial" w:cs="Arial" w:eastAsia="Arial" w:hAnsi="Arial"/>
+          <w:color w:val="1F2937"/>
+          <w:sz w:val="22"/>
+          <w:szCs w:val="22"/>
+        </w:rPr>
+        <w:t xml:space="preserve"> on the VM and is automatically available to Phase 4.</w:t>
+      </w:r>
+    </w:p>
+    <w:p>
+      <w:pPr>
+        <w:spacing w:after="80" w:before="0"/>
+      </w:pPr>
+      <w:r>
+        <w:t xml:space="preserve"/>
+      </w:r>
+    </w:p>
+    <w:p>
+      <w:pPr>
+        <w:pStyle w:val="Heading2"/>
+        <w:spacing w:after="100" w:before="280"/>
+      </w:pPr>
+      <w:r>
+        <w:rPr>
+          <w:rFonts w:ascii="Arial" w:cs="Arial" w:eastAsia="Arial" w:hAnsi="Arial"/>
           <w:b/>
           <w:bCs/>
-          <w:color w:val="7C3AED"/>
-          <w:sz w:val="20"/>
-          <w:szCs w:val="20"/>
-        </w:rPr>
-        <w:t xml:space="preserve"> training/outputs/teacher/ </w:t>
+          <w:color w:val="1F2937"/>
+          <w:sz w:val="28"/>
+          <w:szCs w:val="28"/>
+        </w:rPr>
+        <w:t xml:space="preserve">3.5  Phase 4 — Knowledge distillation (GCP VM)</w:t>
+      </w:r>
+    </w:p>
+    <w:p>
+      <w:pPr>
+        <w:shd w:fill="1E1E1E" w:val="clear"/>
+        <w:spacing w:after="0" w:before="0"/>
+        <w:ind w:left="160" w:right="160"/>
+      </w:pPr>
+      <w:r>
+        <w:rPr>
+          <w:rFonts w:ascii="Courier New" w:cs="Courier New" w:eastAsia="Courier New" w:hAnsi="Courier New"/>
+          <w:color w:val="D4D4D4"/>
+          <w:sz w:val="18"/>
+          <w:szCs w:val="18"/>
+        </w:rPr>
+        <w:t xml:space="preserve">python3 training/src/distill.py \</w:t>
+      </w:r>
+    </w:p>
+    <w:p>
+      <w:pPr>
+        <w:shd w:fill="1E1E1E" w:val="clear"/>
+        <w:spacing w:after="0" w:before="0"/>
+        <w:ind w:left="160" w:right="160"/>
+      </w:pPr>
+      <w:r>
+        <w:rPr>
+          <w:rFonts w:ascii="Courier New" w:cs="Courier New" w:eastAsia="Courier New" w:hAnsi="Courier New"/>
+          <w:color w:val="D4D4D4"/>
+          <w:sz w:val="18"/>
+          <w:szCs w:val="18"/>
+        </w:rPr>
+        <w:t xml:space="preserve">    --config training/configs/phase4_distill.json \</w:t>
+      </w:r>
+    </w:p>
+    <w:p>
+      <w:pPr>
+        <w:shd w:fill="1E1E1E" w:val="clear"/>
+        <w:spacing w:after="0" w:before="0"/>
+        <w:ind w:left="160" w:right="160"/>
+      </w:pPr>
+      <w:r>
+        <w:rPr>
+          <w:rFonts w:ascii="Courier New" w:cs="Courier New" w:eastAsia="Courier New" w:hAnsi="Courier New"/>
+          <w:color w:val="D4D4D4"/>
+          <w:sz w:val="18"/>
+          <w:szCs w:val="18"/>
+        </w:rPr>
+        <w:t xml:space="preserve">    --data training/cache/embeddings \</w:t>
+      </w:r>
+    </w:p>
+    <w:p>
+      <w:pPr>
+        <w:shd w:fill="1E1E1E" w:val="clear"/>
+        <w:spacing w:after="0" w:before="0"/>
+        <w:ind w:left="160" w:right="160"/>
+      </w:pPr>
+      <w:r>
+        <w:rPr>
+          <w:rFonts w:ascii="Courier New" w:cs="Courier New" w:eastAsia="Courier New" w:hAnsi="Courier New"/>
+          <w:color w:val="D4D4D4"/>
+          <w:sz w:val="18"/>
+          <w:szCs w:val="18"/>
+        </w:rPr>
+        <w:t xml:space="preserve">    --teacher training/outputs/teacher/teacher_best.pt</w:t>
+      </w:r>
+    </w:p>
+    <w:p>
+      <w:pPr>
+        <w:spacing w:after="80" w:before="0"/>
+      </w:pPr>
+      <w:r>
+        <w:t xml:space="preserve"/>
+      </w:r>
+    </w:p>
+    <w:p>
+      <w:pPr>
+        <w:spacing w:after="100" w:before="0"/>
+        <w:jc w:val="left"/>
+      </w:pPr>
+      <w:r>
+        <w:rPr>
+          <w:rFonts w:ascii="Arial" w:cs="Arial" w:eastAsia="Arial" w:hAnsi="Arial"/>
+          <w:color w:val="1F2937"/>
+          <w:sz w:val="22"/>
+          <w:szCs w:val="22"/>
+        </w:rPr>
+        <w:t xml:space="preserve">Trains the StudentModel under knowledge distillation from the teacher:</w:t>
       </w:r>
     </w:p>
     <w:p>
@@ -2379,163 +2681,7 @@
           <w:sz w:val="22"/>
           <w:szCs w:val="22"/>
         </w:rPr>
-        <w:t xml:space="preserve">With </w:t>
-      </w:r>
-      <w:r>
-        <w:rPr>
-          <w:rFonts w:ascii="Courier New" w:cs="Courier New" w:eastAsia="Courier New" w:hAnsi="Courier New"/>
-          <w:b/>
-          <w:bCs/>
-          <w:color w:val="7C3AED"/>
-          <w:sz w:val="20"/>
-          <w:szCs w:val="20"/>
-        </w:rPr>
-        <w:t xml:space="preserve"> --upload-teacher-ckpt </w:t>
-      </w:r>
-      <w:r>
-        <w:rPr>
-          <w:rFonts w:ascii="Arial" w:cs="Arial" w:eastAsia="Arial" w:hAnsi="Arial"/>
-          <w:color w:val="1F2937"/>
-          <w:sz w:val="22"/>
-          <w:szCs w:val="22"/>
-        </w:rPr>
-        <w:t xml:space="preserve">, </w:t>
-      </w:r>
-      <w:r>
-        <w:rPr>
-          <w:rFonts w:ascii="Courier New" w:cs="Courier New" w:eastAsia="Courier New" w:hAnsi="Courier New"/>
-          <w:b/>
-          <w:bCs/>
-          <w:color w:val="7C3AED"/>
-          <w:sz w:val="20"/>
-          <w:szCs w:val="20"/>
-        </w:rPr>
-        <w:t xml:space="preserve"> teacher_best.pt </w:t>
-      </w:r>
-      <w:r>
-        <w:rPr>
-          <w:rFonts w:ascii="Arial" w:cs="Arial" w:eastAsia="Arial" w:hAnsi="Arial"/>
-          <w:color w:val="1F2937"/>
-          <w:sz w:val="22"/>
-          <w:szCs w:val="22"/>
-        </w:rPr>
-        <w:t xml:space="preserve"> is uploaded to the </w:t>
-      </w:r>
-      <w:r>
-        <w:rPr>
-          <w:rFonts w:ascii="Courier New" w:cs="Courier New" w:eastAsia="Courier New" w:hAnsi="Courier New"/>
-          <w:b/>
-          <w:bCs/>
-          <w:color w:val="7C3AED"/>
-          <w:sz w:val="20"/>
-          <w:szCs w:val="20"/>
-        </w:rPr>
-        <w:t xml:space="preserve"> yt-sponsor-teacher-checkpoint </w:t>
-      </w:r>
-      <w:r>
-        <w:rPr>
-          <w:rFonts w:ascii="Arial" w:cs="Arial" w:eastAsia="Arial" w:hAnsi="Arial"/>
-          <w:color w:val="1F2937"/>
-          <w:sz w:val="22"/>
-          <w:szCs w:val="22"/>
-        </w:rPr>
-        <w:t xml:space="preserve"> Kaggle Dataset for Phase 4.</w:t>
-      </w:r>
-    </w:p>
-    <w:p>
-      <w:pPr>
-        <w:spacing w:after="80" w:before="0"/>
-      </w:pPr>
-      <w:r>
-        <w:t xml:space="preserve"/>
-      </w:r>
-    </w:p>
-    <w:p>
-      <w:pPr>
-        <w:pStyle w:val="Heading2"/>
-        <w:spacing w:after="100" w:before="280"/>
-      </w:pPr>
-      <w:r>
-        <w:rPr>
-          <w:rFonts w:ascii="Arial" w:cs="Arial" w:eastAsia="Arial" w:hAnsi="Arial"/>
-          <w:b/>
-          <w:bCs/>
-          <w:color w:val="1F2937"/>
-          <w:sz w:val="28"/>
-          <w:szCs w:val="28"/>
-        </w:rPr>
-        <w:t xml:space="preserve">3.5  Phase 4 — Knowledge distillation</w:t>
-      </w:r>
-    </w:p>
-    <w:p>
-      <w:pPr>
-        <w:shd w:fill="1E1E1E" w:val="clear"/>
-        <w:spacing w:after="0" w:before="0"/>
-        <w:ind w:left="160" w:right="160"/>
-      </w:pPr>
-      <w:r>
-        <w:rPr>
-          <w:rFonts w:ascii="Courier New" w:cs="Courier New" w:eastAsia="Courier New" w:hAnsi="Courier New"/>
-          <w:color w:val="D4D4D4"/>
-          <w:sz w:val="18"/>
-          <w:szCs w:val="18"/>
-        </w:rPr>
-        <w:t xml:space="preserve">python training/kaggle_bridge.py \</w:t>
-      </w:r>
-    </w:p>
-    <w:p>
-      <w:pPr>
-        <w:shd w:fill="1E1E1E" w:val="clear"/>
-        <w:spacing w:after="0" w:before="0"/>
-        <w:ind w:left="160" w:right="160"/>
-      </w:pPr>
-      <w:r>
-        <w:rPr>
-          <w:rFonts w:ascii="Courier New" w:cs="Courier New" w:eastAsia="Courier New" w:hAnsi="Courier New"/>
-          <w:color w:val="D4D4D4"/>
-          <w:sz w:val="18"/>
-          <w:szCs w:val="18"/>
-        </w:rPr>
-        <w:t xml:space="preserve">    --config training/configs/phase4_distill.json \</w:t>
-      </w:r>
-    </w:p>
-    <w:p>
-      <w:pPr>
-        <w:shd w:fill="1E1E1E" w:val="clear"/>
-        <w:spacing w:after="0" w:before="0"/>
-        <w:ind w:left="160" w:right="160"/>
-      </w:pPr>
-      <w:r>
-        <w:rPr>
-          <w:rFonts w:ascii="Courier New" w:cs="Courier New" w:eastAsia="Courier New" w:hAnsi="Courier New"/>
-          <w:color w:val="D4D4D4"/>
-          <w:sz w:val="18"/>
-          <w:szCs w:val="18"/>
-        </w:rPr>
-        <w:t xml:space="preserve">    --gpu</w:t>
-      </w:r>
-    </w:p>
-    <w:p>
-      <w:pPr>
-        <w:spacing w:after="80" w:before="0"/>
-      </w:pPr>
-      <w:r>
-        <w:t xml:space="preserve"/>
-      </w:r>
-    </w:p>
-    <w:p>
-      <w:pPr>
-        <w:spacing w:after="100" w:before="0"/>
-        <w:jc w:val="left"/>
-      </w:pPr>
-      <w:r>
-        <w:rPr>
-          <w:rFonts w:ascii="Arial" w:cs="Arial" w:eastAsia="Arial" w:hAnsi="Arial"/>
-          <w:color w:val="1F2937"/>
-          <w:sz w:val="22"/>
-          <w:szCs w:val="22"/>
-        </w:rPr>
-        <w:t xml:space="preserve">Trains the StudentModel under knowledge distillation from the teacher:</w:t>
+        <w:t xml:space="preserve">Teacher soft labels are collected at temperature T=4 before student training begins.</w:t>
       </w:r>
     </w:p>
     <w:p>
@@ -2554,7 +2700,7 @@
           <w:sz w:val="22"/>
           <w:szCs w:val="22"/>
         </w:rPr>
-        <w:t xml:space="preserve">Teacher soft labels are collected at temperature T=4 before student training begins.</w:t>
+        <w:t xml:space="preserve">Loss = 0.7 × KL divergence(teacher soft || student soft) + 0.3 × Focal Loss(student, hard label).</w:t>
       </w:r>
     </w:p>
     <w:p>
@@ -2573,7 +2719,7 @@
           <w:sz w:val="22"/>
           <w:szCs w:val="22"/>
         </w:rPr>
-        <w:t xml:space="preserve">Loss = 0.7 × KL divergence(teacher soft || student soft) + 0.3 × Focal Loss(student, hard label).</w:t>
+        <w:t xml:space="preserve">Focal Loss (γ=2, α=0.25) down-weights easy negatives (the dominant class in most videos).</w:t>
       </w:r>
     </w:p>
     <w:p>
@@ -2592,25 +2738,6 @@
           <w:sz w:val="22"/>
           <w:szCs w:val="22"/>
         </w:rPr>
-        <w:t xml:space="preserve">Focal Loss (γ=2, α=0.25) down-weights easy negatives (the dominant class in most videos).</w:t>
-      </w:r>
-    </w:p>
-    <w:p>
-      <w:pPr>
-        <w:pStyle w:val="ListParagraph"/>
-        <w:numPr>
-          <w:ilvl w:val="0"/>
-          <w:numId w:val="2"/>
-        </w:numPr>
-        <w:spacing w:after="40" w:before="40"/>
-      </w:pPr>
-      <w:r>
-        <w:rPr>
-          <w:rFonts w:ascii="Arial" w:cs="Arial" w:eastAsia="Arial" w:hAnsi="Arial"/>
-          <w:color w:val="1F2937"/>
-          <w:sz w:val="22"/>
-          <w:szCs w:val="22"/>
-        </w:rPr>
         <w:t xml:space="preserve">Output: </w:t>
       </w:r>
       <w:r>
@@ -2667,7 +2794,7 @@
           <w:sz w:val="28"/>
           <w:szCs w:val="28"/>
         </w:rPr>
-        <w:t xml:space="preserve">3.6  Phase 5 — ONNX export</w:t>
+        <w:t xml:space="preserve">3.6  Phase 5 — ONNX export (GCP VM)</w:t>
       </w:r>
     </w:p>
     <w:p>
@@ -2683,7 +2810,7 @@
           <w:sz w:val="18"/>
           <w:szCs w:val="18"/>
         </w:rPr>
-        <w:t xml:space="preserve">python training/kaggle_bridge.py \</w:t>
+        <w:t xml:space="preserve">python3 training/src/export_onnx.py \</w:t>
       </w:r>
     </w:p>
     <w:p>
@@ -2699,7 +2826,23 @@
           <w:sz w:val="18"/>
           <w:szCs w:val="18"/>
         </w:rPr>
-        <w:t xml:space="preserve">    --config training/configs/phase5_export.json</w:t>
+        <w:t xml:space="preserve">    --config training/configs/phase5_export.json \</w:t>
+      </w:r>
+    </w:p>
+    <w:p>
+      <w:pPr>
+        <w:shd w:fill="1E1E1E" w:val="clear"/>
+        <w:spacing w:after="0" w:before="0"/>
+        <w:ind w:left="160" w:right="160"/>
+      </w:pPr>
+      <w:r>
+        <w:rPr>
+          <w:rFonts w:ascii="Courier New" w:cs="Courier New" w:eastAsia="Courier New" w:hAnsi="Courier New"/>
+          <w:color w:val="D4D4D4"/>
+          <w:sz w:val="18"/>
+          <w:szCs w:val="18"/>
+        </w:rPr>
+        <w:t xml:space="preserve">    --student training/outputs/distill/student_best.pt</w:t>
       </w:r>
     </w:p>
     <w:p>

</xml_diff>